<commit_message>
docs: align sprint1 diagrams and data models with implementation
</commit_message>
<xml_diff>
--- a/docs/U3/design/task37-sequence-diagram.docx
+++ b/docs/U3/design/task37-sequence-diagram.docx
@@ -5,47 +5,42 @@
     <w:p>
       <w:pPr>
         <w:pStyle w:val="Title"/>
-        <w:jc w:val="center"/>
       </w:pPr>
       <w:r>
-        <w:t>Task 37: Sequence Diagram เลือกและอ่านแนวข้อสอบ</w:t>
+        <w:t>Task37 U3 Sequence Diagram รายการและหน้าอ่านแนวข้อสอบ</w:t>
+      </w:r>
+    </w:p>
+    <w:p>
+      <w:r>
+        <w:t>ระบบลงทะเบียน Guide Router และเชื่อมหน้าเว็บกับ API แล้ว แผนภาพนี้แสดงเส้นทาง API ที่ใช้งานจริง ผ่าน Node proxy และ ReadGuideService ไม่ใช้เส้นทางข้อมูลตัวอย่างใน browser</w:t>
+      </w:r>
+    </w:p>
+    <w:p>
+      <w:r>
+        <w:t>ภาพใช้ระดับหน้าที่เพื่อให้อธิบายได้ง่าย: หน้าจอรวม JavaScript และ API client ส่วน API รวม Router กับ Service ภายใน Backend คำขอจาก Browser ยังผ่าน Node proxy และตรวจ Login ตามโค้ดจริง แต่ไม่แยกเป็น lifeline ในภาพ และ DAO ที่รวมไว้หมายถึง DAO หลายคลาสตามตารางอ้างอิง ชื่อ path บนลูกศรใช้ backend endpoint ยกเว้น U5 ที่ทั้งสองชั้นใช้ path เดียวกัน รายละเอียด validation และ error อยู่ในคำอธิบายประกอบ</w:t>
       </w:r>
     </w:p>
     <w:p>
       <w:pPr>
-        <w:jc w:val="center"/>
+        <w:pStyle w:val="Heading1"/>
       </w:pPr>
       <w:r>
-        <w:rPr>
-          <w:color w:val="64748B"/>
-          <w:sz w:val="20"/>
-        </w:rPr>
-        <w:t>ตาม API spec ของ Task 35</w:t>
+        <w:t>ดูรายการ กรอง และเปิดอ่านแนวข้อสอบ</w:t>
       </w:r>
     </w:p>
     <w:p>
       <w:pPr>
-        <w:spacing w:after="100"/>
+        <w:pStyle w:val="Heading2"/>
       </w:pPr>
       <w:r>
-        <w:rPr>
-          <w:b/>
-        </w:rPr>
-        <w:t xml:space="preserve">สถานะ: </w:t>
-      </w:r>
-      <w:r>
-        <w:t>เป็นแบบร่างสำหรับตรวจสอบ มี DAO แล้ว แต่ backend ยังไม่ได้ลงทะเบียน guides router และหน้าอ่านยังใช้ CourseData/localStorage</w:t>
+        <w:t>แผนภาพ 1</w:t>
       </w:r>
     </w:p>
     <w:p>
-      <w:pPr>
-        <w:spacing w:after="40"/>
-        <w:jc w:val="center"/>
-      </w:pPr>
       <w:r>
         <w:drawing>
           <wp:inline xmlns:a="http://schemas.openxmlformats.org/drawingml/2006/main" xmlns:pic="http://schemas.openxmlformats.org/drawingml/2006/picture">
-            <wp:extent cx="9052560" cy="5603966"/>
+            <wp:extent cx="6309360" cy="5338989"/>
             <wp:docPr id="1" name="Picture 1"/>
             <wp:cNvGraphicFramePr>
               <a:graphicFrameLocks noChangeAspect="1"/>
@@ -54,7 +49,7 @@
               <a:graphicData uri="http://schemas.openxmlformats.org/drawingml/2006/picture">
                 <pic:pic>
                   <pic:nvPicPr>
-                    <pic:cNvPr id="0" name="sequence.png"/>
+                    <pic:cNvPr id="0" name="rendered-diagrams-11.png"/>
                     <pic:cNvPicPr/>
                   </pic:nvPicPr>
                   <pic:blipFill>
@@ -66,7 +61,7 @@
                   <pic:spPr>
                     <a:xfrm>
                       <a:off x="0" y="0"/>
-                      <a:ext cx="9052560" cy="5603966"/>
+                      <a:ext cx="6309360" cy="5338989"/>
                     </a:xfrm>
                     <a:prstGeom prst="rect"/>
                   </pic:spPr>
@@ -78,16 +73,18 @@
       </w:r>
     </w:p>
     <w:p>
-      <w:pPr>
-        <w:spacing w:after="0"/>
-      </w:pPr>
       <w:r>
-        <w:t>ทุกคำขอต้องผ่านการตรวจ Login และตรวจ path/query ก่อนอ่านข้อมูล หากไม่ผ่านให้ตอบ 401 หรือ 422 ตามข้อกำหนด Task 35</w:t>
+        <w:t>เมื่อเปลี่ยนหรือล้างตัวกรอง หน้าเว็บเรียก API รายการใหม่ เลือกกรองได้เฉพาะ academic_year, semester และ exam_period เมื่อเลือกทั้งหมดจะละ query นั้น ไม่มีตัวกรองผู้สอนตามขอบเขตปัจจุบัน</w:t>
       </w:r>
     </w:p>
     <w:p>
       <w:r>
-        <w:br w:type="page"/>
+        <w:t>has_guides=false หมายถึงวิชานี้ยังไม่มีแนวข้อสอบ ส่วน has_guides=true แต่ items=[] หมายถึงมีแนวข้อสอบแต่ไม่ตรงตัวกรอง หากผู้ใช้เลือกรายการที่ถูกลบหลังโหลดรายการแล้ว หน้าอ่านตอบว่าไม่พบรายการ</w:t>
+      </w:r>
+    </w:p>
+    <w:p>
+      <w:r>
+        <w:t>DAO ในภาพรวม CourseDAO สำหรับตรวจวิชาและ ReadGuideDAO สำหรับอ่านแนวข้อสอบ Backend DTO ยังมี course.instructor_names แต่หน้าอ่านปัจจุบันไม่แสดงผู้สอน</w:t>
       </w:r>
     </w:p>
     <w:p>
@@ -95,659 +92,501 @@
         <w:pStyle w:val="Heading1"/>
       </w:pPr>
       <w:r>
-        <w:t>รายละเอียดการเรียก</w:t>
+        <w:t>ข้อผิดพลาดและขอบเขต</w:t>
       </w:r>
     </w:p>
     <w:tbl>
       <w:tblPr>
-        <w:tblStyle w:val="LightShading-Accent1"/>
         <w:tblW w:type="auto" w:w="0"/>
-        <w:jc w:val="center"/>
-        <w:tblLayout w:type="fixed"/>
+        <w:tblLayout w:type="autofit"/>
         <w:tblLook w:firstColumn="1" w:firstRow="1" w:lastColumn="0" w:lastRow="0" w:noHBand="0" w:noVBand="1" w:val="04A0"/>
       </w:tblPr>
       <w:tblGrid>
-        <w:gridCol w:w="2376"/>
-        <w:gridCol w:w="12888"/>
+        <w:gridCol w:w="5018"/>
+        <w:gridCol w:w="5018"/>
       </w:tblGrid>
       <w:tr>
+        <w:trPr>
+          <w:cantSplit/>
+          <w:tblHeader/>
+        </w:trPr>
         <w:tc>
           <w:tcPr>
-            <w:tcW w:type="dxa" w:w="2376"/>
-            <w:vAlign w:val="center"/>
+            <w:tcW w:type="dxa" w:w="5018"/>
+            <w:tcBorders>
+              <w:top w:val="single" w:sz="4" w:color="D9D9D9"/>
+              <w:left w:val="single" w:sz="4" w:color="D9D9D9"/>
+              <w:bottom w:val="single" w:sz="4" w:color="D9D9D9"/>
+              <w:right w:val="single" w:sz="4" w:color="D9D9D9"/>
+            </w:tcBorders>
+            <w:tcMar>
+              <w:top w:w="85" w:type="dxa"/>
+              <w:left w:w="85" w:type="dxa"/>
+              <w:bottom w:w="85" w:type="dxa"/>
+              <w:right w:w="85" w:type="dxa"/>
+            </w:tcMar>
+            <w:shd w:fill="E8EEF4"/>
           </w:tcPr>
           <w:p>
             <w:pPr>
-              <w:spacing w:after="40"/>
+              <w:spacing w:after="60"/>
             </w:pPr>
             <w:r>
               <w:rPr>
                 <w:b/>
                 <w:sz w:val="18"/>
               </w:rPr>
-              <w:t>อ่านรายการ</w:t>
+              <w:t>กรณี</w:t>
             </w:r>
           </w:p>
         </w:tc>
         <w:tc>
           <w:tcPr>
-            <w:tcW w:type="dxa" w:w="12888"/>
-            <w:vAlign w:val="center"/>
+            <w:tcW w:type="dxa" w:w="5018"/>
+            <w:tcBorders>
+              <w:top w:val="single" w:sz="4" w:color="D9D9D9"/>
+              <w:left w:val="single" w:sz="4" w:color="D9D9D9"/>
+              <w:bottom w:val="single" w:sz="4" w:color="D9D9D9"/>
+              <w:right w:val="single" w:sz="4" w:color="D9D9D9"/>
+            </w:tcBorders>
+            <w:tcMar>
+              <w:top w:w="85" w:type="dxa"/>
+              <w:left w:w="85" w:type="dxa"/>
+              <w:bottom w:w="85" w:type="dxa"/>
+              <w:right w:w="85" w:type="dxa"/>
+            </w:tcMar>
+            <w:shd w:fill="E8EEF4"/>
           </w:tcPr>
           <w:p>
             <w:pPr>
-              <w:spacing w:after="40"/>
-            </w:pPr>
-            <w:r>
-              <w:rPr>
-                <w:sz w:val="18"/>
-              </w:rPr>
-              <w:t>GET /courses/{course_id}/guides ใช้ courses.id ผ่าน list_guides</w:t>
-            </w:r>
-          </w:p>
-        </w:tc>
-      </w:tr>
-      <w:tr>
-        <w:tc>
-          <w:tcPr>
-            <w:tcW w:type="dxa" w:w="2376"/>
-            <w:vAlign w:val="center"/>
-          </w:tcPr>
-          <w:p>
-            <w:pPr>
-              <w:spacing w:after="40"/>
+              <w:spacing w:after="60"/>
             </w:pPr>
             <w:r>
               <w:rPr>
                 <w:b/>
                 <w:sz w:val="18"/>
               </w:rPr>
-              <w:t>กรอง</w:t>
+              <w:t>Response</w:t>
+            </w:r>
+          </w:p>
+        </w:tc>
+      </w:tr>
+      <w:tr>
+        <w:trPr>
+          <w:cantSplit/>
+        </w:trPr>
+        <w:tc>
+          <w:tcPr>
+            <w:tcW w:type="dxa" w:w="5018"/>
+            <w:tcBorders>
+              <w:top w:val="single" w:sz="4" w:color="D9D9D9"/>
+              <w:left w:val="single" w:sz="4" w:color="D9D9D9"/>
+              <w:bottom w:val="single" w:sz="4" w:color="D9D9D9"/>
+              <w:right w:val="single" w:sz="4" w:color="D9D9D9"/>
+            </w:tcBorders>
+            <w:tcMar>
+              <w:top w:w="85" w:type="dxa"/>
+              <w:left w:w="85" w:type="dxa"/>
+              <w:bottom w:w="85" w:type="dxa"/>
+              <w:right w:w="85" w:type="dxa"/>
+            </w:tcMar>
+          </w:tcPr>
+          <w:p>
+            <w:pPr>
+              <w:spacing w:after="60"/>
+            </w:pPr>
+            <w:r>
+              <w:rPr>
+                <w:b w:val="0"/>
+                <w:sz w:val="18"/>
+              </w:rPr>
+              <w:t>Session ใช้ไม่ได้</w:t>
             </w:r>
           </w:p>
         </w:tc>
         <w:tc>
           <w:tcPr>
-            <w:tcW w:type="dxa" w:w="12888"/>
-            <w:vAlign w:val="center"/>
+            <w:tcW w:type="dxa" w:w="5018"/>
+            <w:tcBorders>
+              <w:top w:val="single" w:sz="4" w:color="D9D9D9"/>
+              <w:left w:val="single" w:sz="4" w:color="D9D9D9"/>
+              <w:bottom w:val="single" w:sz="4" w:color="D9D9D9"/>
+              <w:right w:val="single" w:sz="4" w:color="D9D9D9"/>
+            </w:tcBorders>
+            <w:tcMar>
+              <w:top w:w="85" w:type="dxa"/>
+              <w:left w:w="85" w:type="dxa"/>
+              <w:bottom w:w="85" w:type="dxa"/>
+              <w:right w:w="85" w:type="dxa"/>
+            </w:tcMar>
           </w:tcPr>
           <w:p>
             <w:pPr>
-              <w:spacing w:after="40"/>
+              <w:spacing w:after="60"/>
             </w:pPr>
             <w:r>
               <w:rPr>
+                <w:b w:val="0"/>
                 <w:sz w:val="18"/>
               </w:rPr>
-              <w:t>ส่ง academic_year, semester และ exam_period เป็น query เฉพาะค่าที่เลือก; DAO คือ ReadGuideDAO.list_by_course(...)</w:t>
+              <w:t>401 error.code=AUTH_REQUIRED</w:t>
             </w:r>
           </w:p>
         </w:tc>
       </w:tr>
       <w:tr>
+        <w:trPr>
+          <w:cantSplit/>
+        </w:trPr>
         <w:tc>
           <w:tcPr>
-            <w:tcW w:type="dxa" w:w="2376"/>
-            <w:vAlign w:val="center"/>
+            <w:tcW w:type="dxa" w:w="5018"/>
+            <w:tcBorders>
+              <w:top w:val="single" w:sz="4" w:color="D9D9D9"/>
+              <w:left w:val="single" w:sz="4" w:color="D9D9D9"/>
+              <w:bottom w:val="single" w:sz="4" w:color="D9D9D9"/>
+              <w:right w:val="single" w:sz="4" w:color="D9D9D9"/>
+            </w:tcBorders>
+            <w:tcMar>
+              <w:top w:w="85" w:type="dxa"/>
+              <w:left w:w="85" w:type="dxa"/>
+              <w:bottom w:w="85" w:type="dxa"/>
+              <w:right w:w="85" w:type="dxa"/>
+            </w:tcMar>
           </w:tcPr>
           <w:p>
             <w:pPr>
-              <w:spacing w:after="40"/>
+              <w:spacing w:after="60"/>
             </w:pPr>
             <w:r>
               <w:rPr>
-                <w:b/>
+                <w:b w:val="0"/>
                 <w:sz w:val="18"/>
               </w:rPr>
-              <w:t>หา has_guides</w:t>
+              <w:t>path/query ผิด หรือส่ง query ที่ไม่รองรับ</w:t>
             </w:r>
           </w:p>
         </w:tc>
         <w:tc>
           <w:tcPr>
-            <w:tcW w:type="dxa" w:w="12888"/>
-            <w:vAlign w:val="center"/>
+            <w:tcW w:type="dxa" w:w="5018"/>
+            <w:tcBorders>
+              <w:top w:val="single" w:sz="4" w:color="D9D9D9"/>
+              <w:left w:val="single" w:sz="4" w:color="D9D9D9"/>
+              <w:bottom w:val="single" w:sz="4" w:color="D9D9D9"/>
+              <w:right w:val="single" w:sz="4" w:color="D9D9D9"/>
+            </w:tcBorders>
+            <w:tcMar>
+              <w:top w:w="85" w:type="dxa"/>
+              <w:left w:w="85" w:type="dxa"/>
+              <w:bottom w:w="85" w:type="dxa"/>
+              <w:right w:w="85" w:type="dxa"/>
+            </w:tcMar>
           </w:tcPr>
           <w:p>
             <w:pPr>
-              <w:spacing w:after="40"/>
+              <w:spacing w:after="60"/>
             </w:pPr>
             <w:r>
               <w:rPr>
+                <w:b w:val="0"/>
                 <w:sz w:val="18"/>
               </w:rPr>
-              <w:t>ใช้ bool(values["academic_years"]) จาก get_filter_values ก่อนใช้ตัวกรอง</w:t>
+              <w:t>422 error.code=INVALID_PARAMETERS</w:t>
             </w:r>
           </w:p>
         </w:tc>
       </w:tr>
       <w:tr>
+        <w:trPr>
+          <w:cantSplit/>
+        </w:trPr>
         <w:tc>
           <w:tcPr>
-            <w:tcW w:type="dxa" w:w="2376"/>
-            <w:vAlign w:val="center"/>
+            <w:tcW w:type="dxa" w:w="5018"/>
+            <w:tcBorders>
+              <w:top w:val="single" w:sz="4" w:color="D9D9D9"/>
+              <w:left w:val="single" w:sz="4" w:color="D9D9D9"/>
+              <w:bottom w:val="single" w:sz="4" w:color="D9D9D9"/>
+              <w:right w:val="single" w:sz="4" w:color="D9D9D9"/>
+            </w:tcBorders>
+            <w:tcMar>
+              <w:top w:w="85" w:type="dxa"/>
+              <w:left w:w="85" w:type="dxa"/>
+              <w:bottom w:w="85" w:type="dxa"/>
+              <w:right w:w="85" w:type="dxa"/>
+            </w:tcMar>
           </w:tcPr>
           <w:p>
             <w:pPr>
-              <w:spacing w:after="40"/>
+              <w:spacing w:after="60"/>
             </w:pPr>
             <w:r>
               <w:rPr>
-                <w:b/>
+                <w:b w:val="0"/>
                 <w:sz w:val="18"/>
               </w:rPr>
-              <w:t>รายการว่าง</w:t>
+              <w:t>รายวิชาไม่พบ</w:t>
             </w:r>
           </w:p>
         </w:tc>
         <w:tc>
           <w:tcPr>
-            <w:tcW w:type="dxa" w:w="12888"/>
-            <w:vAlign w:val="center"/>
+            <w:tcW w:type="dxa" w:w="5018"/>
+            <w:tcBorders>
+              <w:top w:val="single" w:sz="4" w:color="D9D9D9"/>
+              <w:left w:val="single" w:sz="4" w:color="D9D9D9"/>
+              <w:bottom w:val="single" w:sz="4" w:color="D9D9D9"/>
+              <w:right w:val="single" w:sz="4" w:color="D9D9D9"/>
+            </w:tcBorders>
+            <w:tcMar>
+              <w:top w:w="85" w:type="dxa"/>
+              <w:left w:w="85" w:type="dxa"/>
+              <w:bottom w:w="85" w:type="dxa"/>
+              <w:right w:w="85" w:type="dxa"/>
+            </w:tcMar>
           </w:tcPr>
           <w:p>
             <w:pPr>
-              <w:spacing w:after="40"/>
+              <w:spacing w:after="60"/>
             </w:pPr>
             <w:r>
               <w:rPr>
+                <w:b w:val="0"/>
                 <w:sz w:val="18"/>
               </w:rPr>
-              <w:t>has_guides=false คือวิชายังไม่มีแนวข้อสอบ; has_guides=true กับ items ว่างคือไม่มีรายการตรงตัวกรอง ทั้งคู่ตอบ 200</w:t>
+              <w:t>404 error.code=COURSE_NOT_FOUND</w:t>
             </w:r>
           </w:p>
         </w:tc>
       </w:tr>
       <w:tr>
+        <w:trPr>
+          <w:cantSplit/>
+        </w:trPr>
         <w:tc>
           <w:tcPr>
-            <w:tcW w:type="dxa" w:w="2376"/>
-            <w:vAlign w:val="center"/>
+            <w:tcW w:type="dxa" w:w="5018"/>
+            <w:tcBorders>
+              <w:top w:val="single" w:sz="4" w:color="D9D9D9"/>
+              <w:left w:val="single" w:sz="4" w:color="D9D9D9"/>
+              <w:bottom w:val="single" w:sz="4" w:color="D9D9D9"/>
+              <w:right w:val="single" w:sz="4" w:color="D9D9D9"/>
+            </w:tcBorders>
+            <w:tcMar>
+              <w:top w:w="85" w:type="dxa"/>
+              <w:left w:w="85" w:type="dxa"/>
+              <w:bottom w:w="85" w:type="dxa"/>
+              <w:right w:w="85" w:type="dxa"/>
+            </w:tcMar>
           </w:tcPr>
           <w:p>
             <w:pPr>
-              <w:spacing w:after="40"/>
+              <w:spacing w:after="60"/>
             </w:pPr>
             <w:r>
               <w:rPr>
-                <w:b/>
+                <w:b w:val="0"/>
                 <w:sz w:val="18"/>
               </w:rPr>
-              <w:t>อ่านรายละเอียด</w:t>
+              <w:t>แนวข้อสอบไม่พบ</w:t>
             </w:r>
           </w:p>
         </w:tc>
         <w:tc>
           <w:tcPr>
-            <w:tcW w:type="dxa" w:w="12888"/>
-            <w:vAlign w:val="center"/>
+            <w:tcW w:type="dxa" w:w="5018"/>
+            <w:tcBorders>
+              <w:top w:val="single" w:sz="4" w:color="D9D9D9"/>
+              <w:left w:val="single" w:sz="4" w:color="D9D9D9"/>
+              <w:bottom w:val="single" w:sz="4" w:color="D9D9D9"/>
+              <w:right w:val="single" w:sz="4" w:color="D9D9D9"/>
+            </w:tcBorders>
+            <w:tcMar>
+              <w:top w:w="85" w:type="dxa"/>
+              <w:left w:w="85" w:type="dxa"/>
+              <w:bottom w:w="85" w:type="dxa"/>
+              <w:right w:w="85" w:type="dxa"/>
+            </w:tcMar>
           </w:tcPr>
           <w:p>
             <w:pPr>
-              <w:spacing w:after="40"/>
+              <w:spacing w:after="60"/>
             </w:pPr>
             <w:r>
               <w:rPr>
+                <w:b w:val="0"/>
                 <w:sz w:val="18"/>
               </w:rPr>
-              <w:t>GET /guides/{guide_id} ใช้ guides.id ผ่าน read_guide และ ReadGuideDAO.get_by_id(...)</w:t>
+              <w:t>404 error.code=GUIDE_NOT_FOUND</w:t>
             </w:r>
           </w:p>
         </w:tc>
       </w:tr>
       <w:tr>
+        <w:trPr>
+          <w:cantSplit/>
+        </w:trPr>
         <w:tc>
           <w:tcPr>
-            <w:tcW w:type="dxa" w:w="2376"/>
-            <w:vAlign w:val="center"/>
+            <w:tcW w:type="dxa" w:w="5018"/>
+            <w:tcBorders>
+              <w:top w:val="single" w:sz="4" w:color="D9D9D9"/>
+              <w:left w:val="single" w:sz="4" w:color="D9D9D9"/>
+              <w:bottom w:val="single" w:sz="4" w:color="D9D9D9"/>
+              <w:right w:val="single" w:sz="4" w:color="D9D9D9"/>
+            </w:tcBorders>
+            <w:tcMar>
+              <w:top w:w="85" w:type="dxa"/>
+              <w:left w:w="85" w:type="dxa"/>
+              <w:bottom w:w="85" w:type="dxa"/>
+              <w:right w:w="85" w:type="dxa"/>
+            </w:tcMar>
           </w:tcPr>
           <w:p>
             <w:pPr>
-              <w:spacing w:after="40"/>
+              <w:spacing w:after="60"/>
             </w:pPr>
             <w:r>
               <w:rPr>
-                <w:b/>
+                <w:b w:val="0"/>
                 <w:sz w:val="18"/>
               </w:rPr>
-              <w:t>ข้อมูลรายละเอียด</w:t>
+              <w:t>ข้อผิดพลาดภายในที่ GuideApiRoute จัดการ</w:t>
             </w:r>
           </w:p>
         </w:tc>
         <w:tc>
           <w:tcPr>
-            <w:tcW w:type="dxa" w:w="12888"/>
-            <w:vAlign w:val="center"/>
+            <w:tcW w:type="dxa" w:w="5018"/>
+            <w:tcBorders>
+              <w:top w:val="single" w:sz="4" w:color="D9D9D9"/>
+              <w:left w:val="single" w:sz="4" w:color="D9D9D9"/>
+              <w:bottom w:val="single" w:sz="4" w:color="D9D9D9"/>
+              <w:right w:val="single" w:sz="4" w:color="D9D9D9"/>
+            </w:tcBorders>
+            <w:tcMar>
+              <w:top w:w="85" w:type="dxa"/>
+              <w:left w:w="85" w:type="dxa"/>
+              <w:bottom w:w="85" w:type="dxa"/>
+              <w:right w:w="85" w:type="dxa"/>
+            </w:tcMar>
           </w:tcPr>
           <w:p>
             <w:pPr>
-              <w:spacing w:after="40"/>
+              <w:spacing w:after="60"/>
             </w:pPr>
             <w:r>
               <w:rPr>
+                <w:b w:val="0"/>
                 <w:sz w:val="18"/>
               </w:rPr>
-              <w:t>API ส่ง DTO ตาม Task 35; DAO โหลดความสัมพันธ์ course และ publisher มาพร้อม Guide</w:t>
+              <w:t>500 error.code=INTERNAL_ERROR</w:t>
             </w:r>
           </w:p>
         </w:tc>
       </w:tr>
       <w:tr>
+        <w:trPr>
+          <w:cantSplit/>
+        </w:trPr>
         <w:tc>
           <w:tcPr>
-            <w:tcW w:type="dxa" w:w="2376"/>
-            <w:vAlign w:val="center"/>
+            <w:tcW w:type="dxa" w:w="5018"/>
+            <w:tcBorders>
+              <w:top w:val="single" w:sz="4" w:color="D9D9D9"/>
+              <w:left w:val="single" w:sz="4" w:color="D9D9D9"/>
+              <w:bottom w:val="single" w:sz="4" w:color="D9D9D9"/>
+              <w:right w:val="single" w:sz="4" w:color="D9D9D9"/>
+            </w:tcBorders>
+            <w:tcMar>
+              <w:top w:w="85" w:type="dxa"/>
+              <w:left w:w="85" w:type="dxa"/>
+              <w:bottom w:w="85" w:type="dxa"/>
+              <w:right w:w="85" w:type="dxa"/>
+            </w:tcMar>
           </w:tcPr>
           <w:p>
             <w:pPr>
-              <w:spacing w:after="40"/>
+              <w:spacing w:after="60"/>
             </w:pPr>
             <w:r>
               <w:rPr>
-                <w:b/>
+                <w:b w:val="0"/>
                 <w:sz w:val="18"/>
               </w:rPr>
-              <w:t>ตัวเลือกตัวกรอง</w:t>
+              <w:t>Proxy ติดต่อ backend ไม่ได้หรือ timeout</w:t>
             </w:r>
           </w:p>
         </w:tc>
         <w:tc>
           <w:tcPr>
-            <w:tcW w:type="dxa" w:w="12888"/>
-            <w:vAlign w:val="center"/>
+            <w:tcW w:type="dxa" w:w="5018"/>
+            <w:tcBorders>
+              <w:top w:val="single" w:sz="4" w:color="D9D9D9"/>
+              <w:left w:val="single" w:sz="4" w:color="D9D9D9"/>
+              <w:bottom w:val="single" w:sz="4" w:color="D9D9D9"/>
+              <w:right w:val="single" w:sz="4" w:color="D9D9D9"/>
+            </w:tcBorders>
+            <w:tcMar>
+              <w:top w:w="85" w:type="dxa"/>
+              <w:left w:w="85" w:type="dxa"/>
+              <w:bottom w:w="85" w:type="dxa"/>
+              <w:right w:w="85" w:type="dxa"/>
+            </w:tcMar>
           </w:tcPr>
           <w:p>
             <w:pPr>
-              <w:spacing w:after="40"/>
+              <w:spacing w:after="60"/>
             </w:pPr>
             <w:r>
               <w:rPr>
+                <w:b w:val="0"/>
                 <w:sz w:val="18"/>
               </w:rPr>
-              <w:t>GET /courses/{course_id}/guides/filter-options เรียก read_filter_options และ get_filter_values(...)</w:t>
+              <w:t>502 จาก proxy</w:t>
             </w:r>
           </w:p>
         </w:tc>
       </w:tr>
     </w:tbl>
+    <w:p/>
+    <w:p>
+      <w:r>
+        <w:t>การอ่านไม่ commit หรือเปลี่ยนข้อมูลในฐานข้อมูล ชื่อผู้เผยแพร่ใช้ helper ร่วมกับ U4 ไม่ได้ประกอบชื่อคนละกติกาในแต่ละหน้า</w:t>
+      </w:r>
+    </w:p>
     <w:p>
       <w:pPr>
         <w:pStyle w:val="Heading1"/>
       </w:pPr>
       <w:r>
-        <w:t>ข้อผิดพลาด</w:t>
+        <w:t>ไฟล์อ้างอิง</w:t>
       </w:r>
     </w:p>
-    <w:tbl>
-      <w:tblPr>
-        <w:tblStyle w:val="LightShading-Accent1"/>
-        <w:tblW w:type="auto" w:w="0"/>
-        <w:jc w:val="center"/>
-        <w:tblLayout w:type="fixed"/>
-        <w:tblLook w:firstColumn="1" w:firstRow="1" w:lastColumn="0" w:lastRow="0" w:noHBand="0" w:noVBand="1" w:val="04A0"/>
-      </w:tblPr>
-      <w:tblGrid>
-        <w:gridCol w:w="4819"/>
-        <w:gridCol w:w="4819"/>
-        <w:gridCol w:w="4819"/>
-      </w:tblGrid>
-      <w:tr>
-        <w:tc>
-          <w:tcPr>
-            <w:tcW w:type="dxa" w:w="5040"/>
-          </w:tcPr>
-          <w:p>
-            <w:r>
-              <w:rPr>
-                <w:b/>
-                <w:sz w:val="18"/>
-              </w:rPr>
-              <w:t>เงื่อนไข</w:t>
-            </w:r>
-          </w:p>
-        </w:tc>
-        <w:tc>
-          <w:tcPr>
-            <w:tcW w:type="dxa" w:w="3024"/>
-          </w:tcPr>
-          <w:p>
-            <w:r>
-              <w:rPr>
-                <w:b/>
-                <w:sz w:val="18"/>
-              </w:rPr>
-              <w:t>HTTP / code</w:t>
-            </w:r>
-          </w:p>
-        </w:tc>
-        <w:tc>
-          <w:tcPr>
-            <w:tcW w:type="dxa" w:w="7200"/>
-          </w:tcPr>
-          <w:p>
-            <w:r>
-              <w:rPr>
-                <w:b/>
-                <w:sz w:val="18"/>
-              </w:rPr>
-              <w:t>การจัดการ</w:t>
-            </w:r>
-          </w:p>
-        </w:tc>
-      </w:tr>
-      <w:tr>
-        <w:tc>
-          <w:tcPr>
-            <w:tcW w:type="dxa" w:w="5040"/>
-            <w:vAlign w:val="center"/>
-          </w:tcPr>
-          <w:p>
-            <w:pPr>
-              <w:spacing w:after="20"/>
-            </w:pPr>
-            <w:r>
-              <w:rPr>
-                <w:sz w:val="17"/>
-              </w:rPr>
-              <w:t>ไม่มี Login</w:t>
-            </w:r>
-          </w:p>
-        </w:tc>
-        <w:tc>
-          <w:tcPr>
-            <w:tcW w:type="dxa" w:w="3024"/>
-            <w:vAlign w:val="center"/>
-          </w:tcPr>
-          <w:p>
-            <w:pPr>
-              <w:spacing w:after="20"/>
-            </w:pPr>
-            <w:r>
-              <w:rPr>
-                <w:sz w:val="17"/>
-              </w:rPr>
-              <w:t>401 AUTH_REQUIRED</w:t>
-            </w:r>
-          </w:p>
-        </w:tc>
-        <w:tc>
-          <w:tcPr>
-            <w:tcW w:type="dxa" w:w="7200"/>
-            <w:vAlign w:val="center"/>
-          </w:tcPr>
-          <w:p>
-            <w:pPr>
-              <w:spacing w:after="20"/>
-            </w:pPr>
-            <w:r>
-              <w:rPr>
-                <w:sz w:val="17"/>
-              </w:rPr>
-              <w:t>จบคำขอก่อนอ่านข้อมูลและนำผู้ใช้ไปหน้า Login</w:t>
-            </w:r>
-          </w:p>
-        </w:tc>
-      </w:tr>
-      <w:tr>
-        <w:tc>
-          <w:tcPr>
-            <w:tcW w:type="dxa" w:w="5040"/>
-            <w:vAlign w:val="center"/>
-          </w:tcPr>
-          <w:p>
-            <w:pPr>
-              <w:spacing w:after="20"/>
-            </w:pPr>
-            <w:r>
-              <w:rPr>
-                <w:sz w:val="17"/>
-              </w:rPr>
-              <w:t>Path/query ไม่ถูกต้อง เช่น guide_id=0 หรือ semester=4</w:t>
-            </w:r>
-          </w:p>
-        </w:tc>
-        <w:tc>
-          <w:tcPr>
-            <w:tcW w:type="dxa" w:w="3024"/>
-            <w:vAlign w:val="center"/>
-          </w:tcPr>
-          <w:p>
-            <w:pPr>
-              <w:spacing w:after="20"/>
-            </w:pPr>
-            <w:r>
-              <w:rPr>
-                <w:sz w:val="17"/>
-              </w:rPr>
-              <w:t>422 INVALID_PARAMETERS</w:t>
-            </w:r>
-          </w:p>
-        </w:tc>
-        <w:tc>
-          <w:tcPr>
-            <w:tcW w:type="dxa" w:w="7200"/>
-            <w:vAlign w:val="center"/>
-          </w:tcPr>
-          <w:p>
-            <w:pPr>
-              <w:spacing w:after="20"/>
-            </w:pPr>
-            <w:r>
-              <w:rPr>
-                <w:sz w:val="17"/>
-              </w:rPr>
-              <w:t>จบคำขอก่อนอ่านข้อมูลและแจ้งข้อมูลที่ผิด</w:t>
-            </w:r>
-          </w:p>
-        </w:tc>
-      </w:tr>
-      <w:tr>
-        <w:tc>
-          <w:tcPr>
-            <w:tcW w:type="dxa" w:w="5040"/>
-            <w:vAlign w:val="center"/>
-          </w:tcPr>
-          <w:p>
-            <w:pPr>
-              <w:spacing w:after="20"/>
-            </w:pPr>
-            <w:r>
-              <w:rPr>
-                <w:sz w:val="17"/>
-              </w:rPr>
-              <w:t>CourseDAO.get_by_id คืน None</w:t>
-            </w:r>
-          </w:p>
-        </w:tc>
-        <w:tc>
-          <w:tcPr>
-            <w:tcW w:type="dxa" w:w="3024"/>
-            <w:vAlign w:val="center"/>
-          </w:tcPr>
-          <w:p>
-            <w:pPr>
-              <w:spacing w:after="20"/>
-            </w:pPr>
-            <w:r>
-              <w:rPr>
-                <w:sz w:val="17"/>
-              </w:rPr>
-              <w:t>404 COURSE_NOT_FOUND</w:t>
-            </w:r>
-          </w:p>
-        </w:tc>
-        <w:tc>
-          <w:tcPr>
-            <w:tcW w:type="dxa" w:w="7200"/>
-            <w:vAlign w:val="center"/>
-          </w:tcPr>
-          <w:p>
-            <w:pPr>
-              <w:spacing w:after="20"/>
-            </w:pPr>
-            <w:r>
-              <w:rPr>
-                <w:sz w:val="17"/>
-              </w:rPr>
-              <w:t>แจ้งไม่พบรายวิชา</w:t>
-            </w:r>
-          </w:p>
-        </w:tc>
-      </w:tr>
-      <w:tr>
-        <w:tc>
-          <w:tcPr>
-            <w:tcW w:type="dxa" w:w="5040"/>
-            <w:vAlign w:val="center"/>
-          </w:tcPr>
-          <w:p>
-            <w:pPr>
-              <w:spacing w:after="20"/>
-            </w:pPr>
-            <w:r>
-              <w:rPr>
-                <w:sz w:val="17"/>
-              </w:rPr>
-              <w:t>ReadGuideDAO.get_by_id คืน None</w:t>
-            </w:r>
-          </w:p>
-        </w:tc>
-        <w:tc>
-          <w:tcPr>
-            <w:tcW w:type="dxa" w:w="3024"/>
-            <w:vAlign w:val="center"/>
-          </w:tcPr>
-          <w:p>
-            <w:pPr>
-              <w:spacing w:after="20"/>
-            </w:pPr>
-            <w:r>
-              <w:rPr>
-                <w:sz w:val="17"/>
-              </w:rPr>
-              <w:t>404 GUIDE_NOT_FOUND</w:t>
-            </w:r>
-          </w:p>
-        </w:tc>
-        <w:tc>
-          <w:tcPr>
-            <w:tcW w:type="dxa" w:w="7200"/>
-            <w:vAlign w:val="center"/>
-          </w:tcPr>
-          <w:p>
-            <w:pPr>
-              <w:spacing w:after="20"/>
-            </w:pPr>
-            <w:r>
-              <w:rPr>
-                <w:sz w:val="17"/>
-              </w:rPr>
-              <w:t>แจ้งไม่พบแนวข้อสอบและให้กลับหน้ารายการ</w:t>
-            </w:r>
-          </w:p>
-        </w:tc>
-      </w:tr>
-      <w:tr>
-        <w:tc>
-          <w:tcPr>
-            <w:tcW w:type="dxa" w:w="5040"/>
-            <w:vAlign w:val="center"/>
-          </w:tcPr>
-          <w:p>
-            <w:pPr>
-              <w:spacing w:after="20"/>
-            </w:pPr>
-            <w:r>
-              <w:rPr>
-                <w:sz w:val="17"/>
-              </w:rPr>
-              <w:t>อ่านฐานข้อมูลล้มเหลว</w:t>
-            </w:r>
-          </w:p>
-        </w:tc>
-        <w:tc>
-          <w:tcPr>
-            <w:tcW w:type="dxa" w:w="3024"/>
-            <w:vAlign w:val="center"/>
-          </w:tcPr>
-          <w:p>
-            <w:pPr>
-              <w:spacing w:after="20"/>
-            </w:pPr>
-            <w:r>
-              <w:rPr>
-                <w:sz w:val="17"/>
-              </w:rPr>
-              <w:t>500 INTERNAL_ERROR</w:t>
-            </w:r>
-          </w:p>
-        </w:tc>
-        <w:tc>
-          <w:tcPr>
-            <w:tcW w:type="dxa" w:w="7200"/>
-            <w:vAlign w:val="center"/>
-          </w:tcPr>
-          <w:p>
-            <w:pPr>
-              <w:spacing w:after="20"/>
-            </w:pPr>
-            <w:r>
-              <w:rPr>
-                <w:sz w:val="17"/>
-              </w:rPr>
-              <w:t>แจ้งให้ลองใหม่</w:t>
-            </w:r>
-          </w:p>
-        </w:tc>
-      </w:tr>
-    </w:tbl>
     <w:p>
-      <w:pPr>
-        <w:spacing w:before="100"/>
-      </w:pPr>
       <w:r>
-        <w:rPr>
-          <w:b/>
-          <w:sz w:val="16"/>
-        </w:rPr>
-        <w:t xml:space="preserve">อ้างอิง: </w:t>
+        <w:t>- Guide API spec, Guide Entity และ ER</w:t>
       </w:r>
+    </w:p>
+    <w:p>
       <w:r>
-        <w:rPr>
-          <w:sz w:val="16"/>
-        </w:rPr>
-        <w:t>docs/U3/U3_ guide api.md; backend/app/dao/read_guide_dao.py; backend/app/dao/course_dao.py; backend/app/models/guide.py; backend/app/main.py; frontend/public/js/read-courses.js</w:t>
+        <w:t>- choose-courses.js, read-courses.js, GuideApi และ proxy</w:t>
+      </w:r>
+    </w:p>
+    <w:p>
+      <w:r>
+        <w:t>- Guide Router, GuideApiRoute, ReadGuideService และ ReadGuideDAO</w:t>
       </w:r>
     </w:p>
     <w:sectPr>
-      <w:footerReference w:type="default" r:id="rId10"/>
-      <w:pgSz w:w="15840" w:h="12240" w:orient="landscape"/>
-      <w:pgMar w:top="547" w:right="691" w:bottom="605" w:left="691" w:header="720" w:footer="720" w:gutter="0"/>
+      <w:pgSz w:w="11909" w:h="16834"/>
+      <w:pgMar w:top="936" w:right="936" w:bottom="936" w:left="936" w:header="720" w:footer="720" w:gutter="0"/>
       <w:cols w:space="720"/>
       <w:docGrid w:linePitch="360"/>
     </w:sectPr>
   </w:body>
 </w:document>
-</file>
-
-<file path=word/footer1.xml><?xml version="1.0" encoding="utf-8"?>
-<w:ftr xmlns:m="http://schemas.openxmlformats.org/officeDocument/2006/math" xmlns:mc="http://schemas.openxmlformats.org/markup-compatibility/2006" xmlns:mo="http://schemas.microsoft.com/office/mac/office/2008/main" xmlns:mv="urn:schemas-microsoft-com:mac:vml" xmlns:o="urn:schemas-microsoft-com:office:office" xmlns:r="http://schemas.openxmlformats.org/officeDocument/2006/relationships" xmlns:v="urn:schemas-microsoft-com:vml" xmlns:w10="urn:schemas-microsoft-com:office:word" xmlns:w14="http://schemas.microsoft.com/office/word/2010/wordml" xmlns:w="http://schemas.openxmlformats.org/wordprocessingml/2006/main" xmlns:wne="http://schemas.microsoft.com/office/word/2006/wordml" xmlns:wp14="http://schemas.microsoft.com/office/word/2010/wordprocessingDrawing" xmlns:wp="http://schemas.openxmlformats.org/drawingml/2006/wordprocessingDrawing" xmlns:wpc="http://schemas.microsoft.com/office/word/2010/wordprocessingCanvas" xmlns:wpg="http://schemas.microsoft.com/office/word/2010/wordprocessingGroup" xmlns:wpi="http://schemas.microsoft.com/office/word/2010/wordprocessingInk" xmlns:wps="http://schemas.microsoft.com/office/word/2010/wordprocessingShape" mc:Ignorable="w14 wp14">
-  <w:p>
-    <w:pPr>
-      <w:pStyle w:val="Footer"/>
-      <w:jc w:val="right"/>
-    </w:pPr>
-    <w:r>
-      <w:rPr>
-        <w:rFonts w:ascii="Tahoma" w:hAnsi="Tahoma"/>
-        <w:color w:val="64748B"/>
-        <w:sz w:val="16"/>
-      </w:rPr>
-      <w:t xml:space="preserve">Task 37  |  </w:t>
-    </w:r>
-    <w:fldSimple w:instr="PAGE"/>
-  </w:p>
-</w:ftr>
 </file>
 
 <file path=word/numbering.xml><?xml version="1.0" encoding="utf-8"?>
@@ -1114,12 +953,12 @@
     <w:qFormat/>
     <w:rsid w:val="00FC693F"/>
     <w:pPr>
-      <w:spacing w:after="60"/>
+      <w:spacing w:after="100" w:line="269" w:lineRule="auto"/>
     </w:pPr>
     <w:rPr>
-      <w:rFonts w:ascii="Tahoma" w:hAnsi="Tahoma" w:eastAsia="Tahoma"/>
-      <w:color w:val="263444"/>
-      <w:sz w:val="20"/>
+      <w:rFonts w:ascii="Tahoma" w:hAnsi="Tahoma" w:eastAsia="Tahoma" w:cs="Tahoma"/>
+      <w:color w:val="000000"/>
+      <w:sz w:val="22"/>
     </w:rPr>
   </w:style>
   <w:style w:type="paragraph" w:styleId="Header">
@@ -1177,14 +1016,14 @@
     <w:pPr>
       <w:keepNext/>
       <w:keepLines/>
-      <w:spacing w:before="60" w:after="100"/>
+      <w:spacing w:before="480" w:after="0"/>
       <w:outlineLvl w:val="0"/>
     </w:pPr>
     <w:rPr>
-      <w:rFonts w:asciiTheme="majorHAnsi" w:eastAsiaTheme="majorEastAsia" w:hAnsiTheme="majorHAnsi" w:cstheme="majorBidi" w:ascii="Tahoma" w:hAnsi="Tahoma" w:eastAsia="Tahoma"/>
+      <w:rFonts w:asciiTheme="majorHAnsi" w:eastAsiaTheme="majorEastAsia" w:hAnsiTheme="majorHAnsi" w:cstheme="majorBidi" w:ascii="Tahoma" w:hAnsi="Tahoma" w:eastAsia="Tahoma" w:cs="Tahoma"/>
       <w:b/>
       <w:bCs/>
-      <w:color w:val="18324F"/>
+      <w:color w:val="000000"/>
       <w:sz w:val="30"/>
       <w:szCs w:val="28"/>
     </w:rPr>
@@ -1205,11 +1044,11 @@
       <w:outlineLvl w:val="1"/>
     </w:pPr>
     <w:rPr>
-      <w:rFonts w:asciiTheme="majorHAnsi" w:eastAsiaTheme="majorEastAsia" w:hAnsiTheme="majorHAnsi" w:cstheme="majorBidi" w:ascii="Tahoma" w:hAnsi="Tahoma" w:eastAsia="Tahoma"/>
+      <w:rFonts w:asciiTheme="majorHAnsi" w:eastAsiaTheme="majorEastAsia" w:hAnsiTheme="majorHAnsi" w:cstheme="majorBidi" w:ascii="Tahoma" w:hAnsi="Tahoma" w:eastAsia="Tahoma" w:cs="Tahoma"/>
       <w:b/>
       <w:bCs/>
-      <w:color w:val="2E6F95"/>
-      <w:sz w:val="24"/>
+      <w:color w:val="000000"/>
+      <w:sz w:val="26"/>
       <w:szCs w:val="26"/>
     </w:rPr>
   </w:style>
@@ -1229,10 +1068,11 @@
       <w:outlineLvl w:val="2"/>
     </w:pPr>
     <w:rPr>
-      <w:rFonts w:asciiTheme="majorHAnsi" w:eastAsiaTheme="majorEastAsia" w:hAnsiTheme="majorHAnsi" w:cstheme="majorBidi"/>
+      <w:rFonts w:asciiTheme="majorHAnsi" w:eastAsiaTheme="majorEastAsia" w:hAnsiTheme="majorHAnsi" w:cstheme="majorBidi" w:ascii="Tahoma" w:hAnsi="Tahoma" w:eastAsia="Tahoma" w:cs="Tahoma"/>
       <w:b/>
       <w:bCs/>
-      <w:color w:val="4F81BD" w:themeColor="accent1"/>
+      <w:color w:val="000000"/>
+      <w:sz w:val="22"/>
     </w:rPr>
   </w:style>
   <w:style w:type="paragraph" w:styleId="Heading4">
@@ -1463,19 +1303,15 @@
     <w:qFormat/>
     <w:rsid w:val="00FC693F"/>
     <w:pPr>
-      <w:pBdr>
-        <w:bottom w:val="single" w:sz="8" w:space="4" w:color="4F81BD" w:themeColor="accent1"/>
-      </w:pBdr>
-      <w:spacing w:after="60" w:line="240" w:lineRule="auto"/>
+      <w:spacing w:after="300" w:line="240" w:lineRule="auto"/>
       <w:contextualSpacing/>
     </w:pPr>
     <w:rPr>
-      <w:rFonts w:asciiTheme="majorHAnsi" w:eastAsiaTheme="majorEastAsia" w:hAnsiTheme="majorHAnsi" w:cstheme="majorBidi" w:ascii="Tahoma" w:hAnsi="Tahoma" w:eastAsia="Tahoma"/>
-      <w:b/>
-      <w:color w:val="18324F"/>
+      <w:rFonts w:asciiTheme="majorHAnsi" w:eastAsiaTheme="majorEastAsia" w:hAnsiTheme="majorHAnsi" w:cstheme="majorBidi" w:ascii="Tahoma" w:hAnsi="Tahoma" w:eastAsia="Tahoma" w:cs="Tahoma"/>
+      <w:color w:val="000000"/>
       <w:spacing w:val="5"/>
       <w:kern w:val="28"/>
-      <w:sz w:val="44"/>
+      <w:sz w:val="38"/>
       <w:szCs w:val="52"/>
     </w:rPr>
   </w:style>
@@ -1951,9 +1787,6 @@
     <w:qFormat/>
     <w:rsid w:val="00FC693F"/>
     <w:pPr>
-      <w:pBdr>
-        <w:bottom w:val="single" w:sz="4" w:space="4" w:color="4F81BD" w:themeColor="accent1"/>
-      </w:pBdr>
       <w:spacing w:before="200" w:after="280"/>
       <w:ind w:left="936" w:right="936"/>
     </w:pPr>

</xml_diff>